<commit_message>
Power BI Task 2 updated
</commit_message>
<xml_diff>
--- a/PowerBI Task 2/PowerBILab2_Tutisani.docx
+++ b/PowerBI Task 2/PowerBILab2_Tutisani.docx
@@ -84,15 +84,49 @@
         <w:keepNext/>
       </w:pPr>
       <w:r>
-        <w:t xml:space="preserve">This lab continues from Lab 1, using the same </w:t>
-      </w:r>
-      <w:proofErr w:type="spellStart"/>
-      <w:r>
-        <w:t>AdventureWorks</w:t>
-      </w:r>
-      <w:proofErr w:type="spellEnd"/>
-      <w:r>
-        <w:t xml:space="preserve"> dataset and model. The goal was to build a complete, well-structured report in Power BI Desktop and publish it to Power BI Service. Below are the steps taken along with screenshots of the results.</w:t>
+        <w:t>This lab continues from Lab 1, using the same AdventureWorks dataset and model. The goal was to build a complete, well-structured report in Power BI Desktop and publish it to Power BI Service. Below are the steps taken along with screenshots of the results.</w:t>
+      </w:r>
+    </w:p>
+    <w:p>
+      <w:pPr>
+        <w:keepNext/>
+      </w:pPr>
+      <w:r>
+        <w:drawing>
+          <wp:inline distT="0" distB="0" distL="0" distR="0" wp14:anchorId="3B61BE14" wp14:editId="23CF37F9">
+            <wp:extent cx="5943600" cy="2776855"/>
+            <wp:effectExtent l="0" t="0" r="0" b="4445"/>
+            <wp:docPr id="590004841" name="Picture 1"/>
+            <wp:cNvGraphicFramePr>
+              <a:graphicFrameLocks xmlns:a="http://schemas.openxmlformats.org/drawingml/2006/main" noChangeAspect="1"/>
+            </wp:cNvGraphicFramePr>
+            <a:graphic xmlns:a="http://schemas.openxmlformats.org/drawingml/2006/main">
+              <a:graphicData uri="http://schemas.openxmlformats.org/drawingml/2006/picture">
+                <pic:pic xmlns:pic="http://schemas.openxmlformats.org/drawingml/2006/picture">
+                  <pic:nvPicPr>
+                    <pic:cNvPr id="590004841" name=""/>
+                    <pic:cNvPicPr/>
+                  </pic:nvPicPr>
+                  <pic:blipFill>
+                    <a:blip r:embed="rId6"/>
+                    <a:stretch>
+                      <a:fillRect/>
+                    </a:stretch>
+                  </pic:blipFill>
+                  <pic:spPr>
+                    <a:xfrm>
+                      <a:off x="0" y="0"/>
+                      <a:ext cx="5943600" cy="2776855"/>
+                    </a:xfrm>
+                    <a:prstGeom prst="rect">
+                      <a:avLst/>
+                    </a:prstGeom>
+                  </pic:spPr>
+                </pic:pic>
+              </a:graphicData>
+            </a:graphic>
+          </wp:inline>
+        </w:drawing>
       </w:r>
     </w:p>
     <w:p>
@@ -113,35 +147,15 @@
         <w:keepNext/>
       </w:pPr>
       <w:r>
-        <w:t xml:space="preserve">To allow users to filter the report by customer name, I added two slicers both using the Full Name field from the </w:t>
-      </w:r>
-      <w:proofErr w:type="spellStart"/>
-      <w:r>
-        <w:t>DimCustomer</w:t>
-      </w:r>
-      <w:proofErr w:type="spellEnd"/>
-      <w:r>
-        <w:t xml:space="preserve"> table. The first slicer was left in its default List format, which displays all customer names as a scrollable checklist</w:t>
-      </w:r>
-      <w:r>
-        <w:t>.</w:t>
+        <w:t>To allow users to filter the report by customer name, I added two slicers both using the Full Name field from the DimCustomer table. The first slicer was left in its default List format, which displays all customer names as a scrollable checklist. This is useful when the user wants to see all available options at once. The second slicer was switched to Dropdown format by clicking the slicer's … menu and selecting Dropdown</w:t>
+      </w:r>
+      <w:r>
+        <w:t>,</w:t>
       </w:r>
       <w:r>
         <w:t xml:space="preserve"> </w:t>
       </w:r>
       <w:r>
-        <w:t>T</w:t>
-      </w:r>
-      <w:r>
-        <w:t>his is useful when the user wants to see all available options at once. The second slicer was switched to Dropdown format by clicking the slicer's … menu and selecting Dropdown</w:t>
-      </w:r>
-      <w:r>
-        <w:t>,</w:t>
-      </w:r>
-      <w:r>
-        <w:t xml:space="preserve"> </w:t>
-      </w:r>
-      <w:r>
         <w:t xml:space="preserve">which </w:t>
       </w:r>
       <w:r>
@@ -153,7 +167,11 @@
         <w:keepNext/>
       </w:pPr>
       <w:r>
-        <w:t>Search was enabled on both slicers via the same … menu, since the customer list is very large and scrolling through it manually would be impractical. With Search, users can type a name and immediately narrow down the results, significantly improving the user experience.</w:t>
+        <w:t xml:space="preserve">Search was enabled on both slicers via the same … menu, since the customer list is very large and scrolling through it manually would be impractical. With Search, users can type a </w:t>
+      </w:r>
+      <w:r>
+        <w:lastRenderedPageBreak/>
+        <w:t>name and immediately narrow down the results, significantly improving the user experience.</w:t>
       </w:r>
     </w:p>
     <w:p>
@@ -180,7 +198,7 @@
                     <pic:cNvPicPr/>
                   </pic:nvPicPr>
                   <pic:blipFill>
-                    <a:blip r:embed="rId6"/>
+                    <a:blip r:embed="rId7"/>
                     <a:stretch>
                       <a:fillRect/>
                     </a:stretch>
@@ -204,32 +222,18 @@
     <w:p>
       <w:pPr>
         <w:pStyle w:val="Caption"/>
-        <w:jc w:val="center"/>
       </w:pPr>
       <w:r>
         <w:t xml:space="preserve">Screenshot </w:t>
       </w:r>
-      <w:r>
-        <w:fldChar w:fldCharType="begin"/>
-      </w:r>
-      <w:r>
-        <w:instrText xml:space="preserve"> SEQ Screenshot \* ARABIC </w:instrText>
-      </w:r>
-      <w:r>
-        <w:fldChar w:fldCharType="separate"/>
-      </w:r>
-      <w:r>
-        <w:rPr>
-          <w:noProof/>
-        </w:rPr>
-        <w:t>1</w:t>
-      </w:r>
-      <w:r>
-        <w:rPr>
-          <w:noProof/>
-        </w:rPr>
-        <w:fldChar w:fldCharType="end"/>
-      </w:r>
+      <w:fldSimple w:instr=" SEQ Screenshot \* ARABIC ">
+        <w:r>
+          <w:rPr>
+            <w:noProof/>
+          </w:rPr>
+          <w:t>1</w:t>
+        </w:r>
+      </w:fldSimple>
       <w:r>
         <w:t>. Two Different Types of Slicers with Search</w:t>
       </w:r>
@@ -249,28 +253,7 @@
         <w:keepNext/>
       </w:pPr>
       <w:r>
-        <w:t>The three custom visuals added were</w:t>
-      </w:r>
-      <w:r>
-        <w:t xml:space="preserve"> </w:t>
-      </w:r>
-      <w:r>
-        <w:t>Chiclet Slicer</w:t>
-      </w:r>
-      <w:r>
-        <w:t xml:space="preserve">, </w:t>
-      </w:r>
-      <w:r>
-        <w:t>Bullet Chart</w:t>
-      </w:r>
-      <w:r>
-        <w:t xml:space="preserve">, </w:t>
-      </w:r>
-      <w:r>
-        <w:t>Sunburst</w:t>
-      </w:r>
-      <w:r>
-        <w:t>.</w:t>
+        <w:t>The three custom visuals added were Chiclet Slicer, Bullet Chart, Sunburst.</w:t>
       </w:r>
     </w:p>
     <w:p>
@@ -297,7 +280,7 @@
                     <pic:cNvPicPr/>
                   </pic:nvPicPr>
                   <pic:blipFill>
-                    <a:blip r:embed="rId7"/>
+                    <a:blip r:embed="rId8"/>
                     <a:stretch>
                       <a:fillRect/>
                     </a:stretch>
@@ -328,27 +311,14 @@
       <w:r>
         <w:t xml:space="preserve">Screenshot </w:t>
       </w:r>
-      <w:r>
-        <w:fldChar w:fldCharType="begin"/>
-      </w:r>
-      <w:r>
-        <w:instrText xml:space="preserve"> SEQ Screenshot \* ARABIC </w:instrText>
-      </w:r>
-      <w:r>
-        <w:fldChar w:fldCharType="separate"/>
-      </w:r>
-      <w:r>
-        <w:rPr>
-          <w:noProof/>
-        </w:rPr>
-        <w:t>2</w:t>
-      </w:r>
-      <w:r>
-        <w:rPr>
-          <w:noProof/>
-        </w:rPr>
-        <w:fldChar w:fldCharType="end"/>
-      </w:r>
+      <w:fldSimple w:instr=" SEQ Screenshot \* ARABIC ">
+        <w:r>
+          <w:rPr>
+            <w:noProof/>
+          </w:rPr>
+          <w:t>2</w:t>
+        </w:r>
+      </w:fldSimple>
       <w:r>
         <w:t xml:space="preserve">. Added </w:t>
       </w:r>
@@ -417,15 +387,7 @@
         <w:t>,</w:t>
       </w:r>
       <w:r>
-        <w:t xml:space="preserve"> I added a clear header at the top of the report. The </w:t>
-      </w:r>
-      <w:proofErr w:type="spellStart"/>
-      <w:r>
-        <w:t>AdventureWorks</w:t>
-      </w:r>
-      <w:proofErr w:type="spellEnd"/>
-      <w:r>
-        <w:t xml:space="preserve"> logo was inserted using Insert </w:t>
+        <w:t xml:space="preserve"> I added a clear header at the top of the report. The AdventureWorks logo was inserted using Insert </w:t>
       </w:r>
       <w:r>
         <w:t>-&gt;</w:t>
@@ -437,15 +399,7 @@
         <w:t>Google</w:t>
       </w:r>
       <w:r>
-        <w:t>. A Text Box was added next to it with the report title "</w:t>
-      </w:r>
-      <w:proofErr w:type="spellStart"/>
-      <w:r>
-        <w:t>AdventureWorks</w:t>
-      </w:r>
-      <w:proofErr w:type="spellEnd"/>
-      <w:r>
-        <w:t xml:space="preserve"> Sales Report" formatted in a large, bold font using the report's color palette.</w:t>
+        <w:t>. A Text Box was added next to it with the report title "AdventureWorks Sales Report" formatted in a large, bold font using the report's color palette.</w:t>
       </w:r>
     </w:p>
     <w:p>
@@ -477,7 +431,7 @@
                     <pic:cNvPicPr/>
                   </pic:nvPicPr>
                   <pic:blipFill>
-                    <a:blip r:embed="rId8"/>
+                    <a:blip r:embed="rId9"/>
                     <a:stretch>
                       <a:fillRect/>
                     </a:stretch>
@@ -508,27 +462,14 @@
       <w:r>
         <w:t xml:space="preserve">Screenshot </w:t>
       </w:r>
-      <w:r>
-        <w:fldChar w:fldCharType="begin"/>
-      </w:r>
-      <w:r>
-        <w:instrText xml:space="preserve"> SEQ Screenshot \* ARABIC </w:instrText>
-      </w:r>
-      <w:r>
-        <w:fldChar w:fldCharType="separate"/>
-      </w:r>
-      <w:r>
-        <w:rPr>
-          <w:noProof/>
-        </w:rPr>
-        <w:t>3</w:t>
-      </w:r>
-      <w:r>
-        <w:rPr>
-          <w:noProof/>
-        </w:rPr>
-        <w:fldChar w:fldCharType="end"/>
-      </w:r>
+      <w:fldSimple w:instr=" SEQ Screenshot \* ARABIC ">
+        <w:r>
+          <w:rPr>
+            <w:noProof/>
+          </w:rPr>
+          <w:t>3</w:t>
+        </w:r>
+      </w:fldSimple>
       <w:r>
         <w:t>. Added logo and title as header and grouped it together</w:t>
       </w:r>
@@ -538,7 +479,7 @@
       <w:r>
         <w:t xml:space="preserve">Logo source: </w:t>
       </w:r>
-      <w:hyperlink r:id="rId9" w:history="1">
+      <w:hyperlink r:id="rId10" w:history="1">
         <w:r>
           <w:rPr>
             <w:u w:val="single"/>
@@ -571,23 +512,7 @@
         <w:keepNext/>
       </w:pPr>
       <w:r>
-        <w:t xml:space="preserve">A date slicer was added using the </w:t>
-      </w:r>
-      <w:proofErr w:type="spellStart"/>
-      <w:r>
-        <w:t>OrderDate</w:t>
-      </w:r>
-      <w:proofErr w:type="spellEnd"/>
-      <w:r>
-        <w:t xml:space="preserve"> field from the </w:t>
-      </w:r>
-      <w:proofErr w:type="spellStart"/>
-      <w:r>
-        <w:t>FactInternetSales</w:t>
-      </w:r>
-      <w:proofErr w:type="spellEnd"/>
-      <w:r>
-        <w:t xml:space="preserve"> table. It was configured in Between mode, which displays a slider with two date handles representing the start and end of the selected date range. The current range covers 01.01.2012 to 28.01.2014, matching the available data in the dataset.</w:t>
+        <w:t>A date slicer was added using the OrderDate field from the FactInternetSales table. It was configured in Between mode, which displays a slider with two date handles representing the start and end of the selected date range. The current range covers 01.01.2012 to 28.01.2014, matching the available data in the dataset.</w:t>
       </w:r>
     </w:p>
     <w:p>
@@ -595,13 +520,7 @@
         <w:keepNext/>
       </w:pPr>
       <w:r>
-        <w:t>This is the third slicer type in the report, completing the requirement for three different slicer format</w:t>
-      </w:r>
-      <w:r>
-        <w:t>s</w:t>
-      </w:r>
-      <w:r>
-        <w:t>. A date slicer is particularly useful here because sales analysis is inherently time-based, and giving users control over the date range allows them to focus on specific periods without modifying the report itself.</w:t>
+        <w:t>This is the third slicer type in the report, completing the requirement for three different slicer formats. A date slicer is particularly useful here because sales analysis is inherently time-based, and giving users control over the date range allows them to focus on specific periods without modifying the report itself.</w:t>
       </w:r>
     </w:p>
     <w:p>
@@ -609,6 +528,9 @@
         <w:keepNext/>
       </w:pPr>
       <w:r>
+        <w:rPr>
+          <w:noProof/>
+        </w:rPr>
         <w:drawing>
           <wp:inline distT="0" distB="0" distL="0" distR="0" wp14:anchorId="0BE8355B" wp14:editId="6653A0AD">
             <wp:extent cx="5039428" cy="2448267"/>
@@ -625,7 +547,7 @@
                     <pic:cNvPicPr/>
                   </pic:nvPicPr>
                   <pic:blipFill>
-                    <a:blip r:embed="rId10"/>
+                    <a:blip r:embed="rId11"/>
                     <a:stretch>
                       <a:fillRect/>
                     </a:stretch>
@@ -653,37 +575,19 @@
       <w:r>
         <w:t xml:space="preserve">Screenshot </w:t>
       </w:r>
-      <w:r>
-        <w:fldChar w:fldCharType="begin"/>
-      </w:r>
-      <w:r>
-        <w:instrText xml:space="preserve"> SEQ Screenshot \* ARABIC </w:instrText>
-      </w:r>
-      <w:r>
-        <w:fldChar w:fldCharType="separate"/>
-      </w:r>
-      <w:r>
-        <w:rPr>
-          <w:noProof/>
-        </w:rPr>
-        <w:t>4</w:t>
-      </w:r>
-      <w:r>
-        <w:fldChar w:fldCharType="end"/>
-      </w:r>
+      <w:fldSimple w:instr=" SEQ Screenshot \* ARABIC ">
+        <w:r>
+          <w:rPr>
+            <w:noProof/>
+          </w:rPr>
+          <w:t>4</w:t>
+        </w:r>
+      </w:fldSimple>
       <w:r>
         <w:t xml:space="preserve">. </w:t>
       </w:r>
       <w:r>
-        <w:t>Date Slicer (</w:t>
-      </w:r>
-      <w:proofErr w:type="spellStart"/>
-      <w:r>
-        <w:t>OrderDate</w:t>
-      </w:r>
-      <w:proofErr w:type="spellEnd"/>
-      <w:r>
-        <w:t>)</w:t>
+        <w:t>Date Slicer (OrderDate)</w:t>
       </w:r>
     </w:p>
     <w:p>
@@ -735,39 +639,7 @@
     </w:p>
     <w:p>
       <w:r>
-        <w:t xml:space="preserve">A Line Chart was added to show sales trends over time. The X-axis uses the </w:t>
-      </w:r>
-      <w:proofErr w:type="spellStart"/>
-      <w:r>
-        <w:t>OrderDate</w:t>
-      </w:r>
-      <w:proofErr w:type="spellEnd"/>
-      <w:r>
-        <w:t xml:space="preserve"> field with the full date hierarchy (Year, Quarter, Month, Day), and the Y-axis shows Sum of </w:t>
-      </w:r>
-      <w:proofErr w:type="spellStart"/>
-      <w:r>
-        <w:t>SalesAmount</w:t>
-      </w:r>
-      <w:proofErr w:type="spellEnd"/>
-      <w:r>
-        <w:t xml:space="preserve">. The Legend is set to </w:t>
-      </w:r>
-      <w:proofErr w:type="spellStart"/>
-      <w:r>
-        <w:t>EnglishProductCategoryName</w:t>
-      </w:r>
-      <w:proofErr w:type="spellEnd"/>
-      <w:r>
-        <w:t xml:space="preserve"> from </w:t>
-      </w:r>
-      <w:proofErr w:type="spellStart"/>
-      <w:r>
-        <w:t>DimProductCategory</w:t>
-      </w:r>
-      <w:proofErr w:type="spellEnd"/>
-      <w:r>
-        <w:t>, resulting in three separate lines for Accessories, Bikes, and Clothing.</w:t>
+        <w:t>A Line Chart was added to show sales trends over time. The X-axis uses the OrderDate field with the full date hierarchy (Year, Quarter, Month, Day), and the Y-axis shows Sum of SalesAmount. The Legend is set to EnglishProductCategoryName from DimProductCategory, resulting in three separate lines for Accessories, Bikes, and Clothing.</w:t>
       </w:r>
     </w:p>
     <w:p>
@@ -785,7 +657,7 @@
       <w:pPr>
         <w:keepNext/>
       </w:pPr>
-      <w:hyperlink r:id="rId11" w:history="1"/>
+      <w:hyperlink r:id="rId12" w:history="1"/>
       <w:r>
         <w:rPr>
           <w:noProof/>
@@ -806,7 +678,7 @@
                     <pic:cNvPicPr/>
                   </pic:nvPicPr>
                   <pic:blipFill>
-                    <a:blip r:embed="rId12"/>
+                    <a:blip r:embed="rId13"/>
                     <a:stretch>
                       <a:fillRect/>
                     </a:stretch>
@@ -834,27 +706,14 @@
       <w:r>
         <w:t xml:space="preserve">Screenshot </w:t>
       </w:r>
-      <w:r>
-        <w:fldChar w:fldCharType="begin"/>
-      </w:r>
-      <w:r>
-        <w:instrText xml:space="preserve"> SEQ Screenshot \* ARABIC </w:instrText>
-      </w:r>
-      <w:r>
-        <w:fldChar w:fldCharType="separate"/>
-      </w:r>
-      <w:r>
-        <w:rPr>
-          <w:noProof/>
-        </w:rPr>
-        <w:t>5</w:t>
-      </w:r>
-      <w:r>
-        <w:rPr>
-          <w:noProof/>
-        </w:rPr>
-        <w:fldChar w:fldCharType="end"/>
-      </w:r>
+      <w:fldSimple w:instr=" SEQ Screenshot \* ARABIC ">
+        <w:r>
+          <w:rPr>
+            <w:noProof/>
+          </w:rPr>
+          <w:t>5</w:t>
+        </w:r>
+      </w:fldSimple>
       <w:r>
         <w:t xml:space="preserve">. </w:t>
       </w:r>
@@ -887,42 +746,7 @@
     </w:p>
     <w:p>
       <w:r>
-        <w:t xml:space="preserve">A </w:t>
-      </w:r>
-      <w:r>
-        <w:t xml:space="preserve">Horizontal Clustered Bar Chart was used to compare total sales across different countries. The Y-axis contains </w:t>
-      </w:r>
-      <w:proofErr w:type="spellStart"/>
-      <w:r>
-        <w:t>SalesTerritoryCountry</w:t>
-      </w:r>
-      <w:proofErr w:type="spellEnd"/>
-      <w:r>
-        <w:t xml:space="preserve"> from </w:t>
-      </w:r>
-      <w:proofErr w:type="spellStart"/>
-      <w:r>
-        <w:t>DimSalesTerritory</w:t>
-      </w:r>
-      <w:proofErr w:type="spellEnd"/>
-      <w:r>
-        <w:t xml:space="preserve">, and the X-axis shows Sum of </w:t>
-      </w:r>
-      <w:proofErr w:type="spellStart"/>
-      <w:r>
-        <w:t>SalesAmount</w:t>
-      </w:r>
-      <w:proofErr w:type="spellEnd"/>
-      <w:r>
-        <w:t xml:space="preserve">. The chart is sorted in descending order by </w:t>
-      </w:r>
-      <w:proofErr w:type="spellStart"/>
-      <w:r>
-        <w:t>SalesAmount</w:t>
-      </w:r>
-      <w:proofErr w:type="spellEnd"/>
-      <w:r>
-        <w:t xml:space="preserve"> so the highest-performing countries appear at the top.</w:t>
+        <w:t>A Horizontal Clustered Bar Chart was used to compare total sales across different countries. The Y-axis contains SalesTerritoryCountry from DimSalesTerritory, and the X-axis shows Sum of SalesAmount. The chart is sorted in descending order by SalesAmount so the highest-performing countries appear at the top.</w:t>
       </w:r>
     </w:p>
     <w:p>
@@ -957,7 +781,7 @@
                     <pic:cNvPicPr/>
                   </pic:nvPicPr>
                   <pic:blipFill>
-                    <a:blip r:embed="rId13">
+                    <a:blip r:embed="rId14">
                       <a:extLst>
                         <a:ext uri="{28A0092B-C50C-407E-A947-70E740481C1C}">
                           <a14:useLocalDpi xmlns:a14="http://schemas.microsoft.com/office/drawing/2010/main" val="0"/>
@@ -986,27 +810,14 @@
       <w:r>
         <w:t xml:space="preserve">Screenshot </w:t>
       </w:r>
-      <w:r>
-        <w:fldChar w:fldCharType="begin"/>
-      </w:r>
-      <w:r>
-        <w:instrText xml:space="preserve"> SEQ Screenshot \* ARABIC </w:instrText>
-      </w:r>
-      <w:r>
-        <w:fldChar w:fldCharType="separate"/>
-      </w:r>
-      <w:r>
-        <w:rPr>
-          <w:noProof/>
-        </w:rPr>
-        <w:t>6</w:t>
-      </w:r>
-      <w:r>
-        <w:rPr>
-          <w:noProof/>
-        </w:rPr>
-        <w:fldChar w:fldCharType="end"/>
-      </w:r>
+      <w:fldSimple w:instr=" SEQ Screenshot \* ARABIC ">
+        <w:r>
+          <w:rPr>
+            <w:noProof/>
+          </w:rPr>
+          <w:t>6</w:t>
+        </w:r>
+      </w:fldSimple>
       <w:r>
         <w:t xml:space="preserve">. </w:t>
       </w:r>
@@ -1056,23 +867,7 @@
         <w:keepNext/>
       </w:pPr>
       <w:r>
-        <w:t xml:space="preserve">A Stacked Column Chart was added to show how total sales are distributed across product categories for each year. The X-axis uses the Order Year calculated column created in Lab 1, the Y-axis shows Sum of </w:t>
-      </w:r>
-      <w:proofErr w:type="spellStart"/>
-      <w:r>
-        <w:t>SalesAmount</w:t>
-      </w:r>
-      <w:proofErr w:type="spellEnd"/>
-      <w:r>
-        <w:t xml:space="preserve">, and the Legend is set to </w:t>
-      </w:r>
-      <w:proofErr w:type="spellStart"/>
-      <w:r>
-        <w:t>EnglishProductCategoryName</w:t>
-      </w:r>
-      <w:proofErr w:type="spellEnd"/>
-      <w:r>
-        <w:t>.</w:t>
+        <w:t>A Stacked Column Chart was added to show how total sales are distributed across product categories for each year. The X-axis uses the Order Year calculated column created in Lab 1, the Y-axis shows Sum of SalesAmount, and the Legend is set to EnglishProductCategoryName.</w:t>
       </w:r>
     </w:p>
     <w:p>
@@ -1107,7 +902,7 @@
                     <pic:cNvPicPr/>
                   </pic:nvPicPr>
                   <pic:blipFill>
-                    <a:blip r:embed="rId14">
+                    <a:blip r:embed="rId15">
                       <a:extLst>
                         <a:ext uri="{28A0092B-C50C-407E-A947-70E740481C1C}">
                           <a14:useLocalDpi xmlns:a14="http://schemas.microsoft.com/office/drawing/2010/main" val="0"/>
@@ -1141,27 +936,14 @@
       <w:r>
         <w:t xml:space="preserve">Screenshot </w:t>
       </w:r>
-      <w:r>
-        <w:fldChar w:fldCharType="begin"/>
-      </w:r>
-      <w:r>
-        <w:instrText xml:space="preserve"> SEQ Screenshot \* ARABIC </w:instrText>
-      </w:r>
-      <w:r>
-        <w:fldChar w:fldCharType="separate"/>
-      </w:r>
-      <w:r>
-        <w:rPr>
-          <w:noProof/>
-        </w:rPr>
-        <w:t>7</w:t>
-      </w:r>
-      <w:r>
-        <w:rPr>
-          <w:noProof/>
-        </w:rPr>
-        <w:fldChar w:fldCharType="end"/>
-      </w:r>
+      <w:fldSimple w:instr=" SEQ Screenshot \* ARABIC ">
+        <w:r>
+          <w:rPr>
+            <w:noProof/>
+          </w:rPr>
+          <w:t>7</w:t>
+        </w:r>
+      </w:fldSimple>
       <w:r>
         <w:t xml:space="preserve">. </w:t>
       </w:r>
@@ -1190,39 +972,7 @@
     </w:p>
     <w:p>
       <w:r>
-        <w:t xml:space="preserve">A Matrix visual was added to provide precise numerical detail alongside the charts. The Rows field contains both </w:t>
-      </w:r>
-      <w:proofErr w:type="spellStart"/>
-      <w:r>
-        <w:t>EnglishProductCategoryName</w:t>
-      </w:r>
-      <w:proofErr w:type="spellEnd"/>
-      <w:r>
-        <w:t xml:space="preserve"> and </w:t>
-      </w:r>
-      <w:proofErr w:type="spellStart"/>
-      <w:r>
-        <w:t>EnglishProductSubcategoryName</w:t>
-      </w:r>
-      <w:proofErr w:type="spellEnd"/>
-      <w:r>
-        <w:t xml:space="preserve"> from their respective dimension tables, creating an expandable hierarchy. The Values fields are Sum of </w:t>
-      </w:r>
-      <w:proofErr w:type="spellStart"/>
-      <w:r>
-        <w:t>SalesAmount</w:t>
-      </w:r>
-      <w:proofErr w:type="spellEnd"/>
-      <w:r>
-        <w:t xml:space="preserve"> and Sum of </w:t>
-      </w:r>
-      <w:proofErr w:type="spellStart"/>
-      <w:r>
-        <w:t>OrderQuantity</w:t>
-      </w:r>
-      <w:proofErr w:type="spellEnd"/>
-      <w:r>
-        <w:t>.</w:t>
+        <w:t>A Matrix visual was added to provide precise numerical detail alongside the charts. The Rows field contains both EnglishProductCategoryName and EnglishProductSubcategoryName from their respective dimension tables, creating an expandable hierarchy. The Values fields are Sum of SalesAmount and Sum of OrderQuantity.</w:t>
       </w:r>
     </w:p>
     <w:p>
@@ -1249,7 +999,7 @@
                     <pic:cNvPicPr/>
                   </pic:nvPicPr>
                   <pic:blipFill>
-                    <a:blip r:embed="rId15"/>
+                    <a:blip r:embed="rId16"/>
                     <a:stretch>
                       <a:fillRect/>
                     </a:stretch>
@@ -1277,27 +1027,14 @@
       <w:r>
         <w:t xml:space="preserve">Screenshot </w:t>
       </w:r>
-      <w:r>
-        <w:fldChar w:fldCharType="begin"/>
-      </w:r>
-      <w:r>
-        <w:instrText xml:space="preserve"> SEQ Screenshot \* ARABIC </w:instrText>
-      </w:r>
-      <w:r>
-        <w:fldChar w:fldCharType="separate"/>
-      </w:r>
-      <w:r>
-        <w:rPr>
-          <w:noProof/>
-        </w:rPr>
-        <w:t>8</w:t>
-      </w:r>
-      <w:r>
-        <w:rPr>
-          <w:noProof/>
-        </w:rPr>
-        <w:fldChar w:fldCharType="end"/>
-      </w:r>
+      <w:fldSimple w:instr=" SEQ Screenshot \* ARABIC ">
+        <w:r>
+          <w:rPr>
+            <w:noProof/>
+          </w:rPr>
+          <w:t>8</w:t>
+        </w:r>
+      </w:fldSimple>
       <w:r>
         <w:t xml:space="preserve">. </w:t>
       </w:r>
@@ -1335,23 +1072,7 @@
     </w:p>
     <w:p>
       <w:r>
-        <w:t xml:space="preserve">A Donut Chart was used to show each product category's share of total sales. The Legend is set to </w:t>
-      </w:r>
-      <w:proofErr w:type="spellStart"/>
-      <w:r>
-        <w:t>EnglishProductCategoryName</w:t>
-      </w:r>
-      <w:proofErr w:type="spellEnd"/>
-      <w:r>
-        <w:t xml:space="preserve"> and the Values field uses Sum of </w:t>
-      </w:r>
-      <w:proofErr w:type="spellStart"/>
-      <w:r>
-        <w:t>SalesAmount</w:t>
-      </w:r>
-      <w:proofErr w:type="spellEnd"/>
-      <w:r>
-        <w:t>. Data labels are shown directly on the chart segments to avoid relying solely on the legend.</w:t>
+        <w:t>A Donut Chart was used to show each product category's share of total sales. The Legend is set to EnglishProductCategoryName and the Values field uses Sum of SalesAmount. Data labels are shown directly on the chart segments to avoid relying solely on the legend.</w:t>
       </w:r>
     </w:p>
     <w:p>
@@ -1383,7 +1104,7 @@
                     <pic:cNvPicPr/>
                   </pic:nvPicPr>
                   <pic:blipFill>
-                    <a:blip r:embed="rId16"/>
+                    <a:blip r:embed="rId17"/>
                     <a:stretch>
                       <a:fillRect/>
                     </a:stretch>
@@ -1411,27 +1132,14 @@
       <w:r>
         <w:t xml:space="preserve">Screenshot </w:t>
       </w:r>
-      <w:r>
-        <w:fldChar w:fldCharType="begin"/>
-      </w:r>
-      <w:r>
-        <w:instrText xml:space="preserve"> SEQ Screenshot \* ARABIC </w:instrText>
-      </w:r>
-      <w:r>
-        <w:fldChar w:fldCharType="separate"/>
-      </w:r>
-      <w:r>
-        <w:rPr>
-          <w:noProof/>
-        </w:rPr>
-        <w:t>9</w:t>
-      </w:r>
-      <w:r>
-        <w:rPr>
-          <w:noProof/>
-        </w:rPr>
-        <w:fldChar w:fldCharType="end"/>
-      </w:r>
+      <w:fldSimple w:instr=" SEQ Screenshot \* ARABIC ">
+        <w:r>
+          <w:rPr>
+            <w:noProof/>
+          </w:rPr>
+          <w:t>9</w:t>
+        </w:r>
+      </w:fldSimple>
       <w:r>
         <w:t xml:space="preserve">. </w:t>
       </w:r>
@@ -1464,44 +1172,17 @@
       </w:pPr>
       <w:r>
         <w:lastRenderedPageBreak/>
-        <w:t>Bullet Chart</w:t>
-      </w:r>
-      <w:r>
-        <w:t xml:space="preserve"> – Custom Visual</w:t>
-      </w:r>
-    </w:p>
-    <w:p>
-      <w:r>
-        <w:t xml:space="preserve">The Bullet Chart custom visual was configured with </w:t>
-      </w:r>
-      <w:proofErr w:type="spellStart"/>
-      <w:r>
-        <w:t>EnglishProductCategoryName</w:t>
-      </w:r>
-      <w:proofErr w:type="spellEnd"/>
-      <w:r>
-        <w:t xml:space="preserve"> as the Category, Sum of </w:t>
-      </w:r>
-      <w:proofErr w:type="spellStart"/>
-      <w:r>
-        <w:t>SalesAmount</w:t>
-      </w:r>
-      <w:proofErr w:type="spellEnd"/>
-      <w:r>
-        <w:t xml:space="preserve"> as the Value (the main bar), and Sum of </w:t>
-      </w:r>
-      <w:proofErr w:type="spellStart"/>
-      <w:r>
-        <w:t>DiscountAmount</w:t>
-      </w:r>
-      <w:proofErr w:type="spellEnd"/>
-      <w:r>
-        <w:t xml:space="preserve"> as the Target Value (the marker line). This allows users to see at a glance how sales compare to the discount amounts for each product category.</w:t>
-      </w:r>
-    </w:p>
-    <w:p>
-      <w:r>
-        <w:t>This visual was chosen because it communicates an actual vs. target comparison in a compact, clean format that a standard bar chart cannot achieve natively. It is particularly useful for business stakeholders who want to quickly assess whether discounts are proportionate to sales performance across categories.</w:t>
+        <w:t>Clustered Column Chart</w:t>
+      </w:r>
+    </w:p>
+    <w:p>
+      <w:r>
+        <w:t>A Clustered Column Chart was added to display the top-performing products ranked by total sales amount. The X-axis shows product names sorted in descending order by SalesAmount, and the Y-axis displays the total sales amount for each product. Data labels are enabled on each column to show exact values.</w:t>
+      </w:r>
+    </w:p>
+    <w:p>
+      <w:r>
+        <w:t>This visual was chosen because it provides a clear ranking of product performance, making it immediately obvious which products generate the most revenue. Unlike the previous Bullet Chart configuration (which showed discount amounts that were consistently zero and provided no business insight), this chart highlights actual sales performance and complements the Sunburst visual by offering both a hierarchical view (Sunburst) and a flat, ranked view (Column Chart) of product data. The column chart format is ideal for comparing individual products and identifying top performers at a glance.</w:t>
       </w:r>
     </w:p>
     <w:p>
@@ -1513,8 +1194,8 @@
           <w:noProof/>
         </w:rPr>
         <w:drawing>
-          <wp:inline distT="0" distB="0" distL="0" distR="0" wp14:anchorId="054CA93D" wp14:editId="10EDDAAE">
-            <wp:extent cx="5943600" cy="2914650"/>
+          <wp:inline distT="0" distB="0" distL="0" distR="0" wp14:anchorId="054CA93D" wp14:editId="160657BC">
+            <wp:extent cx="2916363" cy="4762500"/>
             <wp:effectExtent l="0" t="0" r="0" b="0"/>
             <wp:docPr id="1112984530" name="Picture 1"/>
             <wp:cNvGraphicFramePr>
@@ -1524,11 +1205,17 @@
               <a:graphicData uri="http://schemas.openxmlformats.org/drawingml/2006/picture">
                 <pic:pic xmlns:pic="http://schemas.openxmlformats.org/drawingml/2006/picture">
                   <pic:nvPicPr>
-                    <pic:cNvPr id="1112984530" name=""/>
+                    <pic:cNvPr id="1112984530" name="Picture 1"/>
                     <pic:cNvPicPr/>
                   </pic:nvPicPr>
                   <pic:blipFill>
-                    <a:blip r:embed="rId17"/>
+                    <a:blip r:embed="rId18">
+                      <a:extLst>
+                        <a:ext uri="{28A0092B-C50C-407E-A947-70E740481C1C}">
+                          <a14:useLocalDpi xmlns:a14="http://schemas.microsoft.com/office/drawing/2010/main" val="0"/>
+                        </a:ext>
+                      </a:extLst>
+                    </a:blip>
                     <a:stretch>
                       <a:fillRect/>
                     </a:stretch>
@@ -1536,7 +1223,7 @@
                   <pic:spPr>
                     <a:xfrm>
                       <a:off x="0" y="0"/>
-                      <a:ext cx="5943600" cy="2914650"/>
+                      <a:ext cx="2933967" cy="4791247"/>
                     </a:xfrm>
                     <a:prstGeom prst="rect">
                       <a:avLst/>
@@ -1556,32 +1243,25 @@
       <w:r>
         <w:t xml:space="preserve">Screenshot </w:t>
       </w:r>
-      <w:r>
-        <w:fldChar w:fldCharType="begin"/>
-      </w:r>
-      <w:r>
-        <w:instrText xml:space="preserve"> SEQ Screenshot \* ARABIC </w:instrText>
-      </w:r>
-      <w:r>
-        <w:fldChar w:fldCharType="separate"/>
-      </w:r>
-      <w:r>
-        <w:rPr>
-          <w:noProof/>
-        </w:rPr>
-        <w:t>10</w:t>
-      </w:r>
-      <w:r>
-        <w:rPr>
-          <w:noProof/>
-        </w:rPr>
-        <w:fldChar w:fldCharType="end"/>
-      </w:r>
+      <w:fldSimple w:instr=" SEQ Screenshot \* ARABIC ">
+        <w:r>
+          <w:rPr>
+            <w:noProof/>
+          </w:rPr>
+          <w:t>10</w:t>
+        </w:r>
+      </w:fldSimple>
       <w:r>
         <w:t xml:space="preserve">. </w:t>
       </w:r>
       <w:r>
-        <w:t>Bullet Chart (Sales vs. Discounts by Category)</w:t>
+        <w:t xml:space="preserve">Clustered Column Chart </w:t>
+      </w:r>
+      <w:r>
+        <w:t>-</w:t>
+      </w:r>
+      <w:r>
+        <w:t xml:space="preserve"> Top Products by Sales</w:t>
       </w:r>
     </w:p>
     <w:p>
@@ -1612,49 +1292,23 @@
         <w:t>Sunburst</w:t>
       </w:r>
       <w:r>
-        <w:t xml:space="preserve"> – Custom Visual</w:t>
-      </w:r>
-    </w:p>
-    <w:p>
-      <w:r>
-        <w:t xml:space="preserve">The Sunburst custom visual was configured with </w:t>
-      </w:r>
-      <w:proofErr w:type="spellStart"/>
-      <w:r>
-        <w:t>EnglishProductCategoryName</w:t>
-      </w:r>
-      <w:proofErr w:type="spellEnd"/>
-      <w:r>
-        <w:t xml:space="preserve"> and </w:t>
-      </w:r>
-      <w:proofErr w:type="spellStart"/>
-      <w:r>
-        <w:t>EnglishProductSubcategoryName</w:t>
-      </w:r>
-      <w:proofErr w:type="spellEnd"/>
-      <w:r>
-        <w:t xml:space="preserve"> in the Groups field, and Sum of </w:t>
-      </w:r>
-      <w:proofErr w:type="spellStart"/>
-      <w:r>
-        <w:t>SalesAmount</w:t>
-      </w:r>
-      <w:proofErr w:type="spellEnd"/>
-      <w:r>
-        <w:t xml:space="preserve"> as the Value. The outer ring represents subcategories and the inner ring represents the parent categories, allowing users to drill down into the product hierarchy within a single visual.</w:t>
-      </w:r>
-    </w:p>
-    <w:p>
-      <w:r>
-        <w:t xml:space="preserve">This visual was chosen because the </w:t>
-      </w:r>
-      <w:proofErr w:type="spellStart"/>
-      <w:r>
-        <w:t>AdventureWorks</w:t>
-      </w:r>
-      <w:proofErr w:type="spellEnd"/>
-      <w:r>
-        <w:t xml:space="preserve"> product structure is inherently hierarchical, and a Sunburst makes that hierarchy immediately visible. It complements the Matrix visual by providing the same hierarchical breakdown in a more visually engaging format, which is appropriate for an overview page of a report.</w:t>
+        <w:t xml:space="preserve"> </w:t>
+      </w:r>
+      <w:r>
+        <w:t>-</w:t>
+      </w:r>
+      <w:r>
+        <w:t xml:space="preserve"> Custom Visual</w:t>
+      </w:r>
+    </w:p>
+    <w:p>
+      <w:r>
+        <w:t>The Sunburst custom visual was configured with EnglishProductCategoryName and EnglishProductSubcategoryName in the Groups field, and Sum of SalesAmount as the Value. The outer ring represents subcategories and the inner ring represents the parent categories, allowing users to drill down into the product hierarchy within a single visual.</w:t>
+      </w:r>
+    </w:p>
+    <w:p>
+      <w:r>
+        <w:t>This visual was chosen because the AdventureWorks product structure is inherently hierarchical, and a Sunburst makes that hierarchy immediately visible. It complements the Matrix visual by providing the same hierarchical breakdown in a more visually engaging format, which is appropriate for an overview page of a report.</w:t>
       </w:r>
     </w:p>
     <w:p>
@@ -1681,7 +1335,7 @@
                     <pic:cNvPicPr/>
                   </pic:nvPicPr>
                   <pic:blipFill>
-                    <a:blip r:embed="rId18"/>
+                    <a:blip r:embed="rId19"/>
                     <a:stretch>
                       <a:fillRect/>
                     </a:stretch>
@@ -1709,27 +1363,14 @@
       <w:r>
         <w:t xml:space="preserve">Screenshot </w:t>
       </w:r>
-      <w:r>
-        <w:fldChar w:fldCharType="begin"/>
-      </w:r>
-      <w:r>
-        <w:instrText xml:space="preserve"> SEQ Screenshot \* ARABIC </w:instrText>
-      </w:r>
-      <w:r>
-        <w:fldChar w:fldCharType="separate"/>
-      </w:r>
-      <w:r>
-        <w:rPr>
-          <w:noProof/>
-        </w:rPr>
-        <w:t>11</w:t>
-      </w:r>
-      <w:r>
-        <w:rPr>
-          <w:noProof/>
-        </w:rPr>
-        <w:fldChar w:fldCharType="end"/>
-      </w:r>
+      <w:fldSimple w:instr=" SEQ Screenshot \* ARABIC ">
+        <w:r>
+          <w:rPr>
+            <w:noProof/>
+          </w:rPr>
+          <w:t>11</w:t>
+        </w:r>
+      </w:fldSimple>
       <w:r>
         <w:t xml:space="preserve">. </w:t>
       </w:r>
@@ -1777,21 +1418,7 @@
     </w:p>
     <w:p>
       <w:r>
-        <w:t xml:space="preserve">To demonstrate the Edit Interactions feature, I selected the </w:t>
-      </w:r>
-      <w:proofErr w:type="spellStart"/>
-      <w:r>
-        <w:t>OrderDate</w:t>
-      </w:r>
-      <w:proofErr w:type="spellEnd"/>
-      <w:r>
-        <w:t xml:space="preserve"> date slicer and clicked Format </w:t>
-      </w:r>
-      <w:r>
-        <w:t>-&gt;</w:t>
-      </w:r>
-      <w:r>
-        <w:t xml:space="preserve"> Edit Interactions in the top ribbon. This caused interaction control icons to appear above every other visual on the canvas. I then clicked the None (X) icon above the Donut Chart, which disables the slicer's filtering effect on that specific visual.</w:t>
+        <w:t>To demonstrate the Edit Interactions feature, I selected the OrderDate date slicer and clicked Format -&gt; Edit Interactions in the top ribbon. This caused interaction control icons to appear above every other visual on the canvas. I then clicked the None (X) icon above the Donut Chart, which disables the slicer's filtering effect on that specific visual.</w:t>
       </w:r>
     </w:p>
     <w:p>
@@ -1824,7 +1451,7 @@
                     <pic:cNvPicPr/>
                   </pic:nvPicPr>
                   <pic:blipFill>
-                    <a:blip r:embed="rId19">
+                    <a:blip r:embed="rId20">
                       <a:extLst>
                         <a:ext uri="{28A0092B-C50C-407E-A947-70E740481C1C}">
                           <a14:useLocalDpi xmlns:a14="http://schemas.microsoft.com/office/drawing/2010/main" val="0"/>
@@ -1858,27 +1485,14 @@
       <w:r>
         <w:t xml:space="preserve">Screenshot </w:t>
       </w:r>
-      <w:r>
-        <w:fldChar w:fldCharType="begin"/>
-      </w:r>
-      <w:r>
-        <w:instrText xml:space="preserve"> SEQ Screenshot \* ARABIC </w:instrText>
-      </w:r>
-      <w:r>
-        <w:fldChar w:fldCharType="separate"/>
-      </w:r>
-      <w:r>
-        <w:rPr>
-          <w:noProof/>
-        </w:rPr>
-        <w:t>12</w:t>
-      </w:r>
-      <w:r>
-        <w:rPr>
-          <w:noProof/>
-        </w:rPr>
-        <w:fldChar w:fldCharType="end"/>
-      </w:r>
+      <w:fldSimple w:instr=" SEQ Screenshot \* ARABIC ">
+        <w:r>
+          <w:rPr>
+            <w:noProof/>
+          </w:rPr>
+          <w:t>12</w:t>
+        </w:r>
+      </w:fldSimple>
       <w:r>
         <w:t xml:space="preserve">. </w:t>
       </w:r>
@@ -1906,38 +1520,12 @@
     </w:p>
     <w:p>
       <w:r>
-        <w:t xml:space="preserve">A consistent color palette was applied across all visuals to create a cohesive and professional appearance. The colors were chosen to complement the </w:t>
-      </w:r>
-      <w:proofErr w:type="spellStart"/>
-      <w:r>
-        <w:t>AdventureWorks</w:t>
-      </w:r>
-      <w:proofErr w:type="spellEnd"/>
-      <w:r>
-        <w:t xml:space="preserve"> brand</w:t>
-      </w:r>
-      <w:r>
-        <w:t>,</w:t>
-      </w:r>
-      <w:r>
-        <w:t xml:space="preserve"> using the red-orange tones from the logo as the primary accent color, with dark navy and teal as supporting colors.</w:t>
-      </w:r>
-    </w:p>
-    <w:p>
-      <w:r>
-        <w:t xml:space="preserve">The theme was customized via View </w:t>
-      </w:r>
-      <w:r>
-        <w:t>-&gt;</w:t>
-      </w:r>
-      <w:r>
-        <w:t xml:space="preserve"> Themes </w:t>
-      </w:r>
-      <w:r>
-        <w:t>-&gt;</w:t>
-      </w:r>
-      <w:r>
-        <w:t xml:space="preserve"> Customize current theme, where the primary colors were set and applied globally. Charts, text elements, and background accents all follow this palette. Per the design essentials, colors are used strategically</w:t>
+        <w:t>A consistent color palette was applied across all visuals to create a cohesive and professional appearance. The colors were chosen to complement the AdventureWorks brand, using the red-orange tones from the logo as the primary accent color, with dark navy and teal as supporting colors.</w:t>
+      </w:r>
+    </w:p>
+    <w:p>
+      <w:r>
+        <w:t>The theme was customized via View -&gt; Themes -&gt; Customize current theme, where the primary colors were set and applied globally. Charts, text elements, and background accents all follow this palette. Per the design essentials, colors are used strategically</w:t>
       </w:r>
       <w:r>
         <w:t>,</w:t>
@@ -1976,7 +1564,7 @@
                     <pic:cNvPicPr/>
                   </pic:nvPicPr>
                   <pic:blipFill>
-                    <a:blip r:embed="rId20"/>
+                    <a:blip r:embed="rId21"/>
                     <a:stretch>
                       <a:fillRect/>
                     </a:stretch>
@@ -2004,27 +1592,14 @@
       <w:r>
         <w:t xml:space="preserve">Screenshot </w:t>
       </w:r>
-      <w:r>
-        <w:fldChar w:fldCharType="begin"/>
-      </w:r>
-      <w:r>
-        <w:instrText xml:space="preserve"> SEQ Screenshot \* ARABIC </w:instrText>
-      </w:r>
-      <w:r>
-        <w:fldChar w:fldCharType="separate"/>
-      </w:r>
-      <w:r>
-        <w:rPr>
-          <w:noProof/>
-        </w:rPr>
-        <w:t>13</w:t>
-      </w:r>
-      <w:r>
-        <w:rPr>
-          <w:noProof/>
-        </w:rPr>
-        <w:fldChar w:fldCharType="end"/>
-      </w:r>
+      <w:fldSimple w:instr=" SEQ Screenshot \* ARABIC ">
+        <w:r>
+          <w:rPr>
+            <w:noProof/>
+          </w:rPr>
+          <w:t>13</w:t>
+        </w:r>
+      </w:fldSimple>
       <w:r>
         <w:t>. Color Grading</w:t>
       </w:r>
@@ -2050,26 +1625,12 @@
     </w:p>
     <w:p>
       <w:r>
-        <w:t xml:space="preserve">A Map visual was added to the report to display sales data geographically. The Location field was set to City from the </w:t>
-      </w:r>
-      <w:proofErr w:type="spellStart"/>
-      <w:r>
-        <w:t>DimGeography</w:t>
-      </w:r>
-      <w:proofErr w:type="spellEnd"/>
-      <w:r>
-        <w:t xml:space="preserve"> table, which places a dot on the map for each city where sales were recorded. The map is zoomed in on Europe in this screenshot, where a high concentration of customer locations is visible across the UK, France, Germany and surrounding countries.</w:t>
-      </w:r>
-    </w:p>
-    <w:p>
-      <w:r>
-        <w:t>The map gives users an immediate geographic sense of where sales are coming from, which is something no chart or table can communicate as effectively. Per the design essentials, the map is kept clean</w:t>
-      </w:r>
-      <w:r>
-        <w:t>,</w:t>
-      </w:r>
-      <w:r>
-        <w:t xml:space="preserve"> only city-level dots are shown without overloading it with additional layers or colors that would make it hard to read.</w:t>
+        <w:t>A Map visual was added to the report to display sales data geographically. The Location field was set to City from the DimGeography table, which places a dot on the map for each city where sales were recorded. The map is zoomed in on Europe in this screenshot, where a high concentration of customer locations is visible across the UK, France, Germany and surrounding countries.</w:t>
+      </w:r>
+    </w:p>
+    <w:p>
+      <w:r>
+        <w:t>The map provides users with an immediate geographic sense of where sales are concentrated, which no chart or table can communicate as effectively. The geographic data is now fully integrated into the report's filter context through the DimCustomer ↔ DimGeography relationship, ensuring the map responds to all relevant filters (country, date range, product category, etc.) without displaying extraneous data. The map is kept clean with only city-level dots shown, avoiding visual clutter.</w:t>
       </w:r>
     </w:p>
     <w:p>
@@ -2078,10 +1639,10 @@
       </w:pPr>
       <w:r>
         <w:drawing>
-          <wp:inline distT="0" distB="0" distL="0" distR="0" wp14:anchorId="2E6D5CF1" wp14:editId="278BD2C0">
-            <wp:extent cx="5943600" cy="3776345"/>
-            <wp:effectExtent l="0" t="0" r="0" b="0"/>
-            <wp:docPr id="1278552508" name="Picture 1"/>
+          <wp:inline distT="0" distB="0" distL="0" distR="0" wp14:anchorId="36D9E96E" wp14:editId="0EE38131">
+            <wp:extent cx="4207323" cy="5000625"/>
+            <wp:effectExtent l="0" t="0" r="3175" b="0"/>
+            <wp:docPr id="937382834" name="Picture 1"/>
             <wp:cNvGraphicFramePr>
               <a:graphicFrameLocks xmlns:a="http://schemas.openxmlformats.org/drawingml/2006/main" noChangeAspect="1"/>
             </wp:cNvGraphicFramePr>
@@ -2089,11 +1650,11 @@
               <a:graphicData uri="http://schemas.openxmlformats.org/drawingml/2006/picture">
                 <pic:pic xmlns:pic="http://schemas.openxmlformats.org/drawingml/2006/picture">
                   <pic:nvPicPr>
-                    <pic:cNvPr id="1278552508" name=""/>
+                    <pic:cNvPr id="937382834" name=""/>
                     <pic:cNvPicPr/>
                   </pic:nvPicPr>
                   <pic:blipFill>
-                    <a:blip r:embed="rId21"/>
+                    <a:blip r:embed="rId22"/>
                     <a:stretch>
                       <a:fillRect/>
                     </a:stretch>
@@ -2101,7 +1662,7 @@
                   <pic:spPr>
                     <a:xfrm>
                       <a:off x="0" y="0"/>
-                      <a:ext cx="5943600" cy="3776345"/>
+                      <a:ext cx="4216443" cy="5011465"/>
                     </a:xfrm>
                     <a:prstGeom prst="rect">
                       <a:avLst/>
@@ -2121,37 +1682,76 @@
       <w:r>
         <w:t xml:space="preserve">Screenshot </w:t>
       </w:r>
-      <w:r>
-        <w:fldChar w:fldCharType="begin"/>
-      </w:r>
-      <w:r>
-        <w:instrText xml:space="preserve"> SEQ Screenshot \* ARABIC </w:instrText>
-      </w:r>
-      <w:r>
-        <w:fldChar w:fldCharType="separate"/>
-      </w:r>
+      <w:fldSimple w:instr=" SEQ Screenshot \* ARABIC ">
+        <w:r>
+          <w:rPr>
+            <w:noProof/>
+          </w:rPr>
+          <w:t>14</w:t>
+        </w:r>
+      </w:fldSimple>
+      <w:r>
+        <w:t xml:space="preserve">. </w:t>
+      </w:r>
+      <w:r>
+        <w:t>Re-established DimGeography relationship</w:t>
+      </w:r>
+    </w:p>
+    <w:p>
+      <w:pPr>
+        <w:keepNext/>
+      </w:pPr>
       <w:r>
         <w:rPr>
           <w:noProof/>
         </w:rPr>
-        <w:t>14</w:t>
-      </w:r>
-      <w:r>
-        <w:fldChar w:fldCharType="end"/>
-      </w:r>
-      <w:r>
-        <w:t xml:space="preserve">. </w:t>
-      </w:r>
-      <w:r>
-        <w:t xml:space="preserve">Map visual </w:t>
-      </w:r>
-      <w:r>
-        <w:t>zoomed in on Europe</w:t>
-      </w:r>
-    </w:p>
-    <w:p/>
-    <w:p>
-      <w:pPr>
+        <w:lastRenderedPageBreak/>
+        <w:drawing>
+          <wp:inline distT="0" distB="0" distL="0" distR="0" wp14:anchorId="2E6D5CF1" wp14:editId="0CDE9229">
+            <wp:extent cx="5943600" cy="3577252"/>
+            <wp:effectExtent l="0" t="0" r="0" b="4445"/>
+            <wp:docPr id="1278552508" name="Picture 1"/>
+            <wp:cNvGraphicFramePr>
+              <a:graphicFrameLocks xmlns:a="http://schemas.openxmlformats.org/drawingml/2006/main" noChangeAspect="1"/>
+            </wp:cNvGraphicFramePr>
+            <a:graphic xmlns:a="http://schemas.openxmlformats.org/drawingml/2006/main">
+              <a:graphicData uri="http://schemas.openxmlformats.org/drawingml/2006/picture">
+                <pic:pic xmlns:pic="http://schemas.openxmlformats.org/drawingml/2006/picture">
+                  <pic:nvPicPr>
+                    <pic:cNvPr id="1278552508" name="Picture 1"/>
+                    <pic:cNvPicPr/>
+                  </pic:nvPicPr>
+                  <pic:blipFill>
+                    <a:blip r:embed="rId23">
+                      <a:extLst>
+                        <a:ext uri="{28A0092B-C50C-407E-A947-70E740481C1C}">
+                          <a14:useLocalDpi xmlns:a14="http://schemas.microsoft.com/office/drawing/2010/main" val="0"/>
+                        </a:ext>
+                      </a:extLst>
+                    </a:blip>
+                    <a:stretch>
+                      <a:fillRect/>
+                    </a:stretch>
+                  </pic:blipFill>
+                  <pic:spPr>
+                    <a:xfrm>
+                      <a:off x="0" y="0"/>
+                      <a:ext cx="5943600" cy="3577252"/>
+                    </a:xfrm>
+                    <a:prstGeom prst="rect">
+                      <a:avLst/>
+                    </a:prstGeom>
+                  </pic:spPr>
+                </pic:pic>
+              </a:graphicData>
+            </a:graphic>
+          </wp:inline>
+        </w:drawing>
+      </w:r>
+    </w:p>
+    <w:p>
+      <w:pPr>
+        <w:pStyle w:val="Caption"/>
         <w:rPr>
           <w:rFonts w:eastAsia="Times New Roman" w:cs="Calibri"/>
           <w:b/>
@@ -2161,7 +1761,24 @@
         </w:rPr>
       </w:pPr>
       <w:r>
-        <w:br w:type="page"/>
+        <w:t xml:space="preserve">Screenshot </w:t>
+      </w:r>
+      <w:fldSimple w:instr=" SEQ Screenshot \* ARABIC ">
+        <w:r>
+          <w:rPr>
+            <w:noProof/>
+          </w:rPr>
+          <w:t>15</w:t>
+        </w:r>
+      </w:fldSimple>
+      <w:r>
+        <w:t xml:space="preserve">. </w:t>
+      </w:r>
+      <w:r>
+        <w:t xml:space="preserve">Map visual </w:t>
+      </w:r>
+      <w:r>
+        <w:t>zoomed in on Europe</w:t>
       </w:r>
     </w:p>
     <w:p>
@@ -2174,49 +1791,43 @@
         <w:ind w:left="431" w:hanging="431"/>
       </w:pPr>
       <w:r>
+        <w:t>RQ7</w:t>
+      </w:r>
+    </w:p>
+    <w:p>
+      <w:r>
+        <w:t>The Mobile Layout was configured by navigating to View -&gt; Mobile Layout in Power BI Desktop. This opens a phone-shaped canvas where visuals can be dragged and rearranged independently of the desktop layout.</w:t>
+      </w:r>
+    </w:p>
+    <w:p>
+      <w:pPr>
+        <w:rPr>
+          <w:noProof/>
+        </w:rPr>
+      </w:pPr>
+      <w:r>
+        <w:t>The visuals were arranged in a logical top-to-bottom order suitable for a narrow screen: the header and slicers appear first for context and filtering, followed by the key charts (line chart, bar chart, stacked column), then the detailed visuals (matrix, donut, bullet chart, sunburst), and finally the map at the bottom. Each visual was resized to fit the phone width without horizontal scrolling.</w:t>
+      </w:r>
+      <w:r>
+        <w:rPr>
+          <w:noProof/>
+        </w:rPr>
+        <w:t xml:space="preserve"> </w:t>
+      </w:r>
+    </w:p>
+    <w:p>
+      <w:pPr>
+        <w:jc w:val="center"/>
+      </w:pPr>
+      <w:r>
+        <w:rPr>
+          <w:noProof/>
+        </w:rPr>
         <w:lastRenderedPageBreak/>
-        <w:t>RQ7</w:t>
-      </w:r>
-    </w:p>
-    <w:p>
-      <w:r>
-        <w:t xml:space="preserve">The Mobile Layout was configured by navigating to View </w:t>
-      </w:r>
-      <w:r>
-        <w:t>-&gt;</w:t>
-      </w:r>
-      <w:r>
-        <w:t xml:space="preserve"> Mobile Layout in Power BI Desktop. This opens a phone-shaped canvas where visuals can be dragged and rearranged independently of the desktop layout.</w:t>
-      </w:r>
-    </w:p>
-    <w:p>
-      <w:pPr>
-        <w:rPr>
-          <w:noProof/>
-        </w:rPr>
-      </w:pPr>
-      <w:r>
-        <w:t>The visuals were arranged in a logical top-to-bottom order suitable for a narrow screen: the header and slicers appear first for context and filtering, followed by the key charts (line chart, bar chart, stacked column), then the detailed visuals (matrix, donut, bullet chart, sunburst), and finally the map at the bottom. Each visual was resized to fit the phone width without horizontal scrolling.</w:t>
-      </w:r>
-      <w:r>
-        <w:rPr>
-          <w:noProof/>
-        </w:rPr>
-        <w:t xml:space="preserve"> </w:t>
-      </w:r>
-    </w:p>
-    <w:p>
-      <w:pPr>
-        <w:jc w:val="center"/>
-      </w:pPr>
-      <w:r>
-        <w:rPr>
-          <w:noProof/>
-        </w:rPr>
         <w:drawing>
-          <wp:inline distT="0" distB="0" distL="0" distR="0" wp14:anchorId="216C1907" wp14:editId="0CD1959C">
-            <wp:extent cx="1820174" cy="5919785"/>
-            <wp:effectExtent l="0" t="0" r="8890" b="5080"/>
+          <wp:inline distT="0" distB="0" distL="0" distR="0" wp14:anchorId="216C1907" wp14:editId="6C72119D">
+            <wp:extent cx="2647950" cy="8611978"/>
+            <wp:effectExtent l="0" t="0" r="0" b="0"/>
             <wp:docPr id="1261030504" name="Picture 1"/>
             <wp:cNvGraphicFramePr>
               <a:graphicFrameLocks xmlns:a="http://schemas.openxmlformats.org/drawingml/2006/main" noChangeAspect="1"/>
@@ -2229,7 +1840,7 @@
                     <pic:cNvPicPr/>
                   </pic:nvPicPr>
                   <pic:blipFill rotWithShape="1">
-                    <a:blip r:embed="rId22">
+                    <a:blip r:embed="rId24">
                       <a:extLst>
                         <a:ext uri="{28A0092B-C50C-407E-A947-70E740481C1C}">
                           <a14:useLocalDpi xmlns:a14="http://schemas.microsoft.com/office/drawing/2010/main" val="0"/>
@@ -2244,7 +1855,7 @@
                   <pic:spPr bwMode="auto">
                     <a:xfrm>
                       <a:off x="0" y="0"/>
-                      <a:ext cx="1829701" cy="5950771"/>
+                      <a:ext cx="2663846" cy="8663676"/>
                     </a:xfrm>
                     <a:prstGeom prst="rect">
                       <a:avLst/>
@@ -2303,7 +1914,7 @@
                     <pic:cNvPicPr/>
                   </pic:nvPicPr>
                   <pic:blipFill rotWithShape="1">
-                    <a:blip r:embed="rId22">
+                    <a:blip r:embed="rId24">
                       <a:extLst>
                         <a:ext uri="{28A0092B-C50C-407E-A947-70E740481C1C}">
                           <a14:useLocalDpi xmlns:a14="http://schemas.microsoft.com/office/drawing/2010/main" val="0"/>
@@ -2355,13 +1966,7 @@
     </w:p>
     <w:p>
       <w:r>
-        <w:t xml:space="preserve">After completing the report, it was published to Power BI Service by clicking Home </w:t>
-      </w:r>
-      <w:r>
-        <w:t>-&gt;</w:t>
-      </w:r>
-      <w:r>
-        <w:t xml:space="preserve"> Publish in Power BI Desktop and selecting My Workspace as the destination. The publishing process completed successfully as confirmed by the success dialog.</w:t>
+        <w:t>After completing the report, it was published to Power BI Service by clicking Home -&gt; Publish in Power BI Desktop and selecting My Workspace as the destination. The publishing process completed successfully as confirmed by the success dialog.</w:t>
       </w:r>
     </w:p>
     <w:p>
@@ -2398,7 +2003,7 @@
                     <pic:cNvPicPr/>
                   </pic:nvPicPr>
                   <pic:blipFill>
-                    <a:blip r:embed="rId23"/>
+                    <a:blip r:embed="rId25"/>
                     <a:stretch>
                       <a:fillRect/>
                     </a:stretch>
@@ -2426,27 +2031,14 @@
       <w:r>
         <w:t xml:space="preserve">Screenshot </w:t>
       </w:r>
-      <w:r>
-        <w:fldChar w:fldCharType="begin"/>
-      </w:r>
-      <w:r>
-        <w:instrText xml:space="preserve"> SEQ Screenshot \* ARABIC </w:instrText>
-      </w:r>
-      <w:r>
-        <w:fldChar w:fldCharType="separate"/>
-      </w:r>
-      <w:r>
-        <w:rPr>
-          <w:noProof/>
-        </w:rPr>
-        <w:t>15</w:t>
-      </w:r>
-      <w:r>
-        <w:rPr>
-          <w:noProof/>
-        </w:rPr>
-        <w:fldChar w:fldCharType="end"/>
-      </w:r>
+      <w:fldSimple w:instr=" SEQ Screenshot \* ARABIC ">
+        <w:r>
+          <w:rPr>
+            <w:noProof/>
+          </w:rPr>
+          <w:t>16</w:t>
+        </w:r>
+      </w:fldSimple>
       <w:r>
         <w:t>. Publishing to My Workspace</w:t>
       </w:r>
@@ -2476,7 +2068,7 @@
                     <pic:cNvPicPr/>
                   </pic:nvPicPr>
                   <pic:blipFill>
-                    <a:blip r:embed="rId24" cstate="print">
+                    <a:blip r:embed="rId26" cstate="print">
                       <a:extLst>
                         <a:ext uri="{28A0092B-C50C-407E-A947-70E740481C1C}">
                           <a14:useLocalDpi xmlns:a14="http://schemas.microsoft.com/office/drawing/2010/main" val="0"/>
@@ -2510,27 +2102,14 @@
       <w:r>
         <w:t xml:space="preserve">Screenshot </w:t>
       </w:r>
-      <w:r>
-        <w:fldChar w:fldCharType="begin"/>
-      </w:r>
-      <w:r>
-        <w:instrText xml:space="preserve"> SEQ Screenshot \* ARABIC </w:instrText>
-      </w:r>
-      <w:r>
-        <w:fldChar w:fldCharType="separate"/>
-      </w:r>
-      <w:r>
-        <w:rPr>
-          <w:noProof/>
-        </w:rPr>
-        <w:t>16</w:t>
-      </w:r>
-      <w:r>
-        <w:rPr>
-          <w:noProof/>
-        </w:rPr>
-        <w:fldChar w:fldCharType="end"/>
-      </w:r>
+      <w:fldSimple w:instr=" SEQ Screenshot \* ARABIC ">
+        <w:r>
+          <w:rPr>
+            <w:noProof/>
+          </w:rPr>
+          <w:t>17</w:t>
+        </w:r>
+      </w:fldSimple>
       <w:r>
         <w:t>. Published</w:t>
       </w:r>
@@ -2633,7 +2212,7 @@
                     <pic:cNvPicPr/>
                   </pic:nvPicPr>
                   <pic:blipFill>
-                    <a:blip r:embed="rId25"/>
+                    <a:blip r:embed="rId27"/>
                     <a:stretch>
                       <a:fillRect/>
                     </a:stretch>
@@ -2661,27 +2240,14 @@
       <w:r>
         <w:t xml:space="preserve">Screenshot </w:t>
       </w:r>
-      <w:r>
-        <w:fldChar w:fldCharType="begin"/>
-      </w:r>
-      <w:r>
-        <w:instrText xml:space="preserve"> SEQ Screenshot \* ARABIC </w:instrText>
-      </w:r>
-      <w:r>
-        <w:fldChar w:fldCharType="separate"/>
-      </w:r>
-      <w:r>
-        <w:rPr>
-          <w:noProof/>
-        </w:rPr>
-        <w:t>17</w:t>
-      </w:r>
-      <w:r>
-        <w:rPr>
-          <w:noProof/>
-        </w:rPr>
-        <w:fldChar w:fldCharType="end"/>
-      </w:r>
+      <w:fldSimple w:instr=" SEQ Screenshot \* ARABIC ">
+        <w:r>
+          <w:rPr>
+            <w:noProof/>
+          </w:rPr>
+          <w:t>18</w:t>
+        </w:r>
+      </w:fldSimple>
       <w:r>
         <w:t>. Scheduled refresh</w:t>
       </w:r>
@@ -2716,33 +2282,43 @@
     </w:p>
     <w:p>
       <w:r>
-        <w:t xml:space="preserve">The following link opens the report pre-filtered to show data for the </w:t>
-      </w:r>
-      <w:r>
-        <w:t>Australia</w:t>
-      </w:r>
-      <w:r>
-        <w:t xml:space="preserve"> only:</w:t>
-      </w:r>
-    </w:p>
-    <w:p>
-      <w:pPr>
-        <w:rPr>
-          <w:u w:val="single"/>
-        </w:rPr>
-      </w:pPr>
-      <w:hyperlink r:id="rId26" w:history="1">
+        <w:t>The following link opens the report pre-filtered to show data for the Australia only:</w:t>
+      </w:r>
+    </w:p>
+    <w:p>
+      <w:hyperlink r:id="rId28" w:history="1">
         <w:r>
           <w:rPr>
-            <w:u w:val="single"/>
+            <w:rStyle w:val="Hyperlink"/>
           </w:rPr>
-          <w:t>https://app.powerbi.com/groups/me/reports/99fcf5de-c7cb-4f7d-8e87-5a551e407dd8/7a64566ba6b819620260?experience=power-bi&amp;filter=DimSalesTerritory%2FSalesTerritoryCountry%20eq%20%27Australia%27</w:t>
+          <w:t>https://app.powerbi.com/groups/me/r</w:t>
+        </w:r>
+        <w:r>
+          <w:rPr>
+            <w:rStyle w:val="Hyperlink"/>
+          </w:rPr>
+          <w:t>e</w:t>
+        </w:r>
+        <w:r>
+          <w:rPr>
+            <w:rStyle w:val="Hyperlink"/>
+          </w:rPr>
+          <w:t>ports/99fcf5de-c7cb-4f7d-8e87-5a551e407dd8/7a64566ba6b819620260?experience=power-bi</w:t>
         </w:r>
       </w:hyperlink>
-    </w:p>
-    <w:p>
-      <w:r>
-        <w:t xml:space="preserve">This feature is useful for sharing a focused view of the report with specific stakeholders — for example, sending </w:t>
+      <w:r>
+        <w:t xml:space="preserve"> </w:t>
+      </w:r>
+    </w:p>
+    <w:p>
+      <w:r>
+        <w:t>This feature is useful for sharing a focused view of the report with specific stakeholders</w:t>
+      </w:r>
+      <w:r>
+        <w:t>,</w:t>
+      </w:r>
+      <w:r>
+        <w:t xml:space="preserve"> for example, sending </w:t>
       </w:r>
       <w:r>
         <w:t>Australia</w:t>
@@ -2766,13 +2342,7 @@
     </w:p>
     <w:p>
       <w:r>
-        <w:t>This lab covered the full cycle of building and publishing a Power BI report</w:t>
-      </w:r>
-      <w:r>
-        <w:t>,</w:t>
-      </w:r>
-      <w:r>
-        <w:t xml:space="preserve"> from designing visuals and applying a consistent color theme, to configuring slicers, interactions, mobile layout, and finally publishing to Power BI Service with a scheduled refresh. The finished report is structured clearly, uses a variety of visual types appropriate to the data, and is accessible to end users both on desktop and mobile.</w:t>
+        <w:t>This lab covered the full cycle of building and publishing a Power BI report, from designing visuals and applying a consistent color theme, to configuring slicers, interactions, mobile layout, and finally publishing to Power BI Service with a scheduled refresh. The finished report is structured clearly, uses a variety of visual types appropriate to the data, and is accessible to end users both on desktop and mobile.</w:t>
       </w:r>
     </w:p>
     <w:p>
@@ -4493,6 +4063,18 @@
       <w:shd w:val="clear" w:color="auto" w:fill="E1DFDD"/>
     </w:rPr>
   </w:style>
+  <w:style w:type="character" w:styleId="FollowedHyperlink">
+    <w:name w:val="FollowedHyperlink"/>
+    <w:basedOn w:val="DefaultParagraphFont"/>
+    <w:uiPriority w:val="99"/>
+    <w:semiHidden/>
+    <w:unhideWhenUsed/>
+    <w:rsid w:val="00BA6A7C"/>
+    <w:rPr>
+      <w:color w:val="96607D" w:themeColor="followedHyperlink"/>
+      <w:u w:val="single"/>
+    </w:rPr>
+  </w:style>
 </w:styles>
 </file>
 

</xml_diff>